<commit_message>
En el doc resumen puse definiciones simples de weas de contabilidad
</commit_message>
<xml_diff>
--- a/Proyecto/resumen.docx
+++ b/Proyecto/resumen.docx
@@ -66,7 +66,491 @@
       <w:r>
         <w:t xml:space="preserve"> a x mes del año x hasta x fecha, bueno lo importante es que podrá guardar cuentas ya se le han dejado debido a que son las mas comunes, el precio de estas cuentas y podrá agregar indefinidamente, ya después se genera el balance automáticamente, estos datos del balance si quisiese también se fuesen al libro diario y ahí mismo agregar mas cuentas y luego todo al libro mayor </w:t>
       </w:r>
+      <w:r>
+        <w:br/>
+      </w:r>
+      <w:r>
+        <w:br/>
+      </w:r>
     </w:p>
+    <w:tbl>
+      <w:tblPr>
+        <w:tblStyle w:val="Tablaconcuadrcula"/>
+        <w:tblW w:w="0" w:type="auto"/>
+        <w:tblLook w:val="04A0" w:firstRow="1" w:lastRow="0" w:firstColumn="1" w:lastColumn="0" w:noHBand="0" w:noVBand="1"/>
+      </w:tblPr>
+      <w:tblGrid>
+        <w:gridCol w:w="2942"/>
+        <w:gridCol w:w="2943"/>
+        <w:gridCol w:w="2943"/>
+      </w:tblGrid>
+      <w:tr>
+        <w:tc>
+          <w:tcPr>
+            <w:tcW w:w="2942" w:type="dxa"/>
+          </w:tcPr>
+          <w:p>
+            <w:r>
+              <w:t>Entidad</w:t>
+            </w:r>
+          </w:p>
+        </w:tc>
+        <w:tc>
+          <w:tcPr>
+            <w:tcW w:w="2943" w:type="dxa"/>
+          </w:tcPr>
+          <w:p>
+            <w:r>
+              <w:t>Que representa</w:t>
+            </w:r>
+          </w:p>
+        </w:tc>
+        <w:tc>
+          <w:tcPr>
+            <w:tcW w:w="2943" w:type="dxa"/>
+          </w:tcPr>
+          <w:p>
+            <w:r>
+              <w:t>Por qué es necesario</w:t>
+            </w:r>
+          </w:p>
+        </w:tc>
+      </w:tr>
+      <w:tr>
+        <w:tc>
+          <w:tcPr>
+            <w:tcW w:w="2942" w:type="dxa"/>
+          </w:tcPr>
+          <w:p>
+            <w:r>
+              <w:t>Usuario</w:t>
+            </w:r>
+          </w:p>
+        </w:tc>
+        <w:tc>
+          <w:tcPr>
+            <w:tcW w:w="2943" w:type="dxa"/>
+          </w:tcPr>
+          <w:p>
+            <w:r>
+              <w:t>Ya saben que representa no mamen</w:t>
+            </w:r>
+          </w:p>
+        </w:tc>
+        <w:tc>
+          <w:tcPr>
+            <w:tcW w:w="2943" w:type="dxa"/>
+          </w:tcPr>
+          <w:p>
+            <w:r>
+              <w:t xml:space="preserve">Guardar los datos del idiota, como su nombre, correo </w:t>
+            </w:r>
+            <w:proofErr w:type="spellStart"/>
+            <w:r>
+              <w:t>y</w:t>
+            </w:r>
+            <w:proofErr w:type="spellEnd"/>
+            <w:r>
+              <w:t xml:space="preserve"> ID</w:t>
+            </w:r>
+          </w:p>
+        </w:tc>
+      </w:tr>
+      <w:tr>
+        <w:tc>
+          <w:tcPr>
+            <w:tcW w:w="2942" w:type="dxa"/>
+          </w:tcPr>
+          <w:p>
+            <w:proofErr w:type="spellStart"/>
+            <w:r>
+              <w:t>PersonaComun</w:t>
+            </w:r>
+            <w:proofErr w:type="spellEnd"/>
+          </w:p>
+        </w:tc>
+        <w:tc>
+          <w:tcPr>
+            <w:tcW w:w="2943" w:type="dxa"/>
+          </w:tcPr>
+          <w:p>
+            <w:r>
+              <w:t>Subtipo de Usuario (Persona natural sin empresa)</w:t>
+            </w:r>
+          </w:p>
+        </w:tc>
+        <w:tc>
+          <w:tcPr>
+            <w:tcW w:w="2943" w:type="dxa"/>
+          </w:tcPr>
+          <w:p>
+            <w:r>
+              <w:t>Tiene comportamiento y limites diferentes, hereda todo lo de un usuario normal</w:t>
+            </w:r>
+          </w:p>
+        </w:tc>
+      </w:tr>
+      <w:tr>
+        <w:tc>
+          <w:tcPr>
+            <w:tcW w:w="2942" w:type="dxa"/>
+          </w:tcPr>
+          <w:p>
+            <w:proofErr w:type="spellStart"/>
+            <w:r>
+              <w:t>UsuarioMicroEmpresa</w:t>
+            </w:r>
+            <w:proofErr w:type="spellEnd"/>
+          </w:p>
+        </w:tc>
+        <w:tc>
+          <w:tcPr>
+            <w:tcW w:w="2943" w:type="dxa"/>
+          </w:tcPr>
+          <w:p>
+            <w:r>
+              <w:t>Subtipo de Usuario (empleado de una microempresa).</w:t>
+            </w:r>
+          </w:p>
+        </w:tc>
+        <w:tc>
+          <w:tcPr>
+            <w:tcW w:w="2943" w:type="dxa"/>
+          </w:tcPr>
+          <w:p>
+            <w:r>
+              <w:t xml:space="preserve">Hereda todo lo de Usuario mas este tiene un rol/cargo </w:t>
+            </w:r>
+            <w:r>
+              <w:t xml:space="preserve">y a la empresa que pertenece </w:t>
+            </w:r>
+          </w:p>
+        </w:tc>
+      </w:tr>
+      <w:tr>
+        <w:tc>
+          <w:tcPr>
+            <w:tcW w:w="2942" w:type="dxa"/>
+          </w:tcPr>
+          <w:p>
+            <w:proofErr w:type="spellStart"/>
+            <w:r>
+              <w:t>MicroEmpresa</w:t>
+            </w:r>
+            <w:proofErr w:type="spellEnd"/>
+          </w:p>
+        </w:tc>
+        <w:tc>
+          <w:tcPr>
+            <w:tcW w:w="2943" w:type="dxa"/>
+          </w:tcPr>
+          <w:p>
+            <w:r>
+              <w:t>La empresa (natural o jurídica)</w:t>
+            </w:r>
+          </w:p>
+        </w:tc>
+        <w:tc>
+          <w:tcPr>
+            <w:tcW w:w="2943" w:type="dxa"/>
+          </w:tcPr>
+          <w:p>
+            <w:r>
+              <w:t>Necesitamos guardar su nombre, tipo y NIT</w:t>
+            </w:r>
+          </w:p>
+        </w:tc>
+      </w:tr>
+      <w:tr>
+        <w:tc>
+          <w:tcPr>
+            <w:tcW w:w="2942" w:type="dxa"/>
+          </w:tcPr>
+          <w:p>
+            <w:proofErr w:type="spellStart"/>
+            <w:r>
+              <w:t>CatalogoCuentas</w:t>
+            </w:r>
+            <w:proofErr w:type="spellEnd"/>
+          </w:p>
+        </w:tc>
+        <w:tc>
+          <w:tcPr>
+            <w:tcW w:w="2943" w:type="dxa"/>
+          </w:tcPr>
+          <w:p>
+            <w:r>
+              <w:t>Catalogo global de cuentas predefinidas que le damos pues</w:t>
+            </w:r>
+          </w:p>
+        </w:tc>
+        <w:tc>
+          <w:tcPr>
+            <w:tcW w:w="2943" w:type="dxa"/>
+          </w:tcPr>
+          <w:p>
+            <w:r>
+              <w:t>Es la base</w:t>
+            </w:r>
+            <w:r>
+              <w:t xml:space="preserve"> de cuentas en el sistema ofrece, ósea nosotros les ofrecemos unas cuentas por si desean usarla</w:t>
+            </w:r>
+          </w:p>
+        </w:tc>
+      </w:tr>
+      <w:tr>
+        <w:tc>
+          <w:tcPr>
+            <w:tcW w:w="2942" w:type="dxa"/>
+          </w:tcPr>
+          <w:p>
+            <w:r>
+              <w:lastRenderedPageBreak/>
+              <w:t>Cuenta</w:t>
+            </w:r>
+          </w:p>
+        </w:tc>
+        <w:tc>
+          <w:tcPr>
+            <w:tcW w:w="2943" w:type="dxa"/>
+          </w:tcPr>
+          <w:p>
+            <w:r>
+              <w:t xml:space="preserve">La cuenta que </w:t>
+            </w:r>
+            <w:proofErr w:type="spellStart"/>
+            <w:r>
+              <w:t>escogio</w:t>
+            </w:r>
+            <w:proofErr w:type="spellEnd"/>
+            <w:r>
+              <w:t xml:space="preserve"> estas abarcan Caja, Banco, clientes y </w:t>
+            </w:r>
+            <w:proofErr w:type="spellStart"/>
+            <w:r>
+              <w:t>asi</w:t>
+            </w:r>
+            <w:proofErr w:type="spellEnd"/>
+          </w:p>
+        </w:tc>
+        <w:tc>
+          <w:tcPr>
+            <w:tcW w:w="2943" w:type="dxa"/>
+          </w:tcPr>
+          <w:p>
+            <w:r>
+              <w:t>Es la cuenta en sí, con nombre, tipo, código</w:t>
+            </w:r>
+          </w:p>
+        </w:tc>
+      </w:tr>
+      <w:tr>
+        <w:tc>
+          <w:tcPr>
+            <w:tcW w:w="2942" w:type="dxa"/>
+          </w:tcPr>
+          <w:p>
+            <w:proofErr w:type="spellStart"/>
+            <w:r>
+              <w:t>CuentaPersonalizada</w:t>
+            </w:r>
+            <w:proofErr w:type="spellEnd"/>
+          </w:p>
+        </w:tc>
+        <w:tc>
+          <w:tcPr>
+            <w:tcW w:w="2943" w:type="dxa"/>
+          </w:tcPr>
+          <w:p>
+            <w:r>
+              <w:t>Personalización de una cuenta por un usuario o Microempresa</w:t>
+            </w:r>
+          </w:p>
+        </w:tc>
+        <w:tc>
+          <w:tcPr>
+            <w:tcW w:w="2943" w:type="dxa"/>
+          </w:tcPr>
+          <w:p>
+            <w:r>
+              <w:t xml:space="preserve">Permite cambiar el nombre de una cuenta sin afectar el </w:t>
+            </w:r>
+            <w:r>
+              <w:t>catálogo</w:t>
+            </w:r>
+            <w:r>
+              <w:t xml:space="preserve"> global</w:t>
+            </w:r>
+          </w:p>
+        </w:tc>
+      </w:tr>
+      <w:tr>
+        <w:tc>
+          <w:tcPr>
+            <w:tcW w:w="2942" w:type="dxa"/>
+          </w:tcPr>
+          <w:p>
+            <w:proofErr w:type="spellStart"/>
+            <w:r>
+              <w:t>AsientoContable</w:t>
+            </w:r>
+            <w:proofErr w:type="spellEnd"/>
+          </w:p>
+        </w:tc>
+        <w:tc>
+          <w:tcPr>
+            <w:tcW w:w="2943" w:type="dxa"/>
+          </w:tcPr>
+          <w:p>
+            <w:r>
+              <w:t>Registro de una transacción en el Libro Diario</w:t>
+            </w:r>
+          </w:p>
+        </w:tc>
+        <w:tc>
+          <w:tcPr>
+            <w:tcW w:w="2943" w:type="dxa"/>
+          </w:tcPr>
+          <w:p>
+            <w:r>
+              <w:t xml:space="preserve">Es básicamente un registro de la fecha que se hizo la </w:t>
+            </w:r>
+            <w:proofErr w:type="spellStart"/>
+            <w:r>
+              <w:t>wea</w:t>
+            </w:r>
+            <w:proofErr w:type="spellEnd"/>
+            <w:r>
+              <w:t xml:space="preserve">, que hicimos tipo </w:t>
+            </w:r>
+            <w:proofErr w:type="spellStart"/>
+            <w:r>
+              <w:t>is</w:t>
+            </w:r>
+            <w:proofErr w:type="spellEnd"/>
+            <w:r>
+              <w:t xml:space="preserve"> gastamos o ganamos y el numero de lo que gastamos </w:t>
+            </w:r>
+          </w:p>
+        </w:tc>
+      </w:tr>
+      <w:tr>
+        <w:tc>
+          <w:tcPr>
+            <w:tcW w:w="2942" w:type="dxa"/>
+          </w:tcPr>
+          <w:p>
+            <w:proofErr w:type="spellStart"/>
+            <w:r>
+              <w:t>MovimientoAsiento</w:t>
+            </w:r>
+            <w:proofErr w:type="spellEnd"/>
+          </w:p>
+        </w:tc>
+        <w:tc>
+          <w:tcPr>
+            <w:tcW w:w="2943" w:type="dxa"/>
+          </w:tcPr>
+          <w:p>
+            <w:r>
+              <w:t>Detalle de un asiento: cuenta+ debe/haber + monto</w:t>
+            </w:r>
+          </w:p>
+        </w:tc>
+        <w:tc>
+          <w:tcPr>
+            <w:tcW w:w="2943" w:type="dxa"/>
+          </w:tcPr>
+          <w:p>
+            <w:r>
+              <w:t xml:space="preserve">Un asiento tiene varios movimientos </w:t>
+            </w:r>
+          </w:p>
+        </w:tc>
+      </w:tr>
+      <w:tr>
+        <w:tc>
+          <w:tcPr>
+            <w:tcW w:w="2942" w:type="dxa"/>
+          </w:tcPr>
+          <w:p>
+            <w:proofErr w:type="spellStart"/>
+            <w:r>
+              <w:t>BalanceGeneral</w:t>
+            </w:r>
+            <w:proofErr w:type="spellEnd"/>
+            <w:r>
+              <w:t xml:space="preserve"> </w:t>
+            </w:r>
+          </w:p>
+        </w:tc>
+        <w:tc>
+          <w:tcPr>
+            <w:tcW w:w="2943" w:type="dxa"/>
+          </w:tcPr>
+          <w:p>
+            <w:r>
+              <w:t xml:space="preserve">Es básicamente que tan jodido estamos, sirve para ver si tenemos más deuda o ganancia </w:t>
+            </w:r>
+          </w:p>
+        </w:tc>
+        <w:tc>
+          <w:tcPr>
+            <w:tcW w:w="2943" w:type="dxa"/>
+          </w:tcPr>
+          <w:p>
+            <w:r>
+              <w:t>Tiene encabezad, fecha, totales</w:t>
+            </w:r>
+          </w:p>
+        </w:tc>
+      </w:tr>
+      <w:tr>
+        <w:tc>
+          <w:tcPr>
+            <w:tcW w:w="2942" w:type="dxa"/>
+          </w:tcPr>
+          <w:p>
+            <w:proofErr w:type="spellStart"/>
+            <w:r>
+              <w:t>BalanceCuenta</w:t>
+            </w:r>
+            <w:proofErr w:type="spellEnd"/>
+          </w:p>
+        </w:tc>
+        <w:tc>
+          <w:tcPr>
+            <w:tcW w:w="2943" w:type="dxa"/>
+          </w:tcPr>
+          <w:p>
+            <w:r>
+              <w:t>Detalle de una cuenta dentro de un balance con su monto</w:t>
+            </w:r>
+          </w:p>
+        </w:tc>
+        <w:tc>
+          <w:tcPr>
+            <w:tcW w:w="2943" w:type="dxa"/>
+          </w:tcPr>
+          <w:p>
+            <w:proofErr w:type="spellStart"/>
+            <w:r>
+              <w:t>Osea</w:t>
+            </w:r>
+            <w:proofErr w:type="spellEnd"/>
+            <w:r>
+              <w:t xml:space="preserve"> que cuenta es , cuanto costo y </w:t>
+            </w:r>
+            <w:proofErr w:type="spellStart"/>
+            <w:r>
+              <w:t>asi</w:t>
+            </w:r>
+            <w:proofErr w:type="spellEnd"/>
+          </w:p>
+        </w:tc>
+      </w:tr>
+    </w:tbl>
+    <w:p/>
     <w:sectPr>
       <w:pgSz w:w="12240" w:h="15840"/>
       <w:pgMar w:top="1417" w:right="1701" w:bottom="1417" w:left="1701" w:header="708" w:footer="708" w:gutter="0"/>
@@ -680,6 +1164,7 @@
   <w:style w:type="character" w:default="1" w:styleId="Fuentedeprrafopredeter">
     <w:name w:val="Default Paragraph Font"/>
     <w:uiPriority w:val="1"/>
+    <w:semiHidden/>
     <w:unhideWhenUsed/>
   </w:style>
   <w:style w:type="table" w:default="1" w:styleId="Tablanormal">
@@ -992,6 +1477,25 @@
       <w:color w:val="2F5496" w:themeColor="accent1" w:themeShade="BF"/>
       <w:spacing w:val="5"/>
     </w:rPr>
+  </w:style>
+  <w:style w:type="table" w:styleId="Tablaconcuadrcula">
+    <w:name w:val="Table Grid"/>
+    <w:basedOn w:val="Tablanormal"/>
+    <w:uiPriority w:val="39"/>
+    <w:rsid w:val="008143CD"/>
+    <w:pPr>
+      <w:spacing w:after="0" w:line="240" w:lineRule="auto"/>
+    </w:pPr>
+    <w:tblPr>
+      <w:tblBorders>
+        <w:top w:val="single" w:sz="4" w:space="0" w:color="auto"/>
+        <w:left w:val="single" w:sz="4" w:space="0" w:color="auto"/>
+        <w:bottom w:val="single" w:sz="4" w:space="0" w:color="auto"/>
+        <w:right w:val="single" w:sz="4" w:space="0" w:color="auto"/>
+        <w:insideH w:val="single" w:sz="4" w:space="0" w:color="auto"/>
+        <w:insideV w:val="single" w:sz="4" w:space="0" w:color="auto"/>
+      </w:tblBorders>
+    </w:tblPr>
   </w:style>
 </w:styles>
 </file>

</xml_diff>